<commit_message>
All details added for patters, updated Task2
</commit_message>
<xml_diff>
--- a/Task2.docx
+++ b/Task2.docx
@@ -32,13 +32,8 @@
       <w:r>
         <w:t xml:space="preserve">xecuting </w:t>
       </w:r>
-      <w:proofErr w:type="gramStart"/>
-      <w:r>
-        <w:t>several</w:t>
-      </w:r>
-      <w:proofErr w:type="gramEnd"/>
-      <w:r>
-        <w:t xml:space="preserve"> types</w:t>
+      <w:r>
+        <w:t>several types</w:t>
       </w:r>
       <w:r>
         <w:t xml:space="preserve"> of workflows. The system should remain independent of any specific business process so that the same workflow can be reused in different environment. This adds onto our research, which shows that reusable workflow engines keep </w:t>
@@ -66,14 +61,17 @@
           <w:numId w:val="8"/>
         </w:numPr>
       </w:pPr>
-      <w:r>
-        <w:t xml:space="preserve">Create and manage running workflow </w:t>
-      </w:r>
-      <w:proofErr w:type="gramStart"/>
-      <w:r>
-        <w:t>instances</w:t>
-      </w:r>
-      <w:proofErr w:type="gramEnd"/>
+      <w:proofErr w:type="spellStart"/>
+      <w:r>
+        <w:t>C</w:t>
+      </w:r>
+      <w:r>
+        <w:t>toring</w:t>
+      </w:r>
+      <w:proofErr w:type="spellEnd"/>
+      <w:r>
+        <w:t xml:space="preserve"> reusable workflow definitions;</w:t>
+      </w:r>
     </w:p>
     <w:p>
       <w:pPr>
@@ -84,13 +82,8 @@
         </w:numPr>
       </w:pPr>
       <w:r>
-        <w:t xml:space="preserve">Manage the work items and tasks in a </w:t>
-      </w:r>
-      <w:proofErr w:type="gramStart"/>
-      <w:r>
-        <w:t>workflow</w:t>
-      </w:r>
-      <w:proofErr w:type="gramEnd"/>
+        <w:t>creating independent workflow instances from those definitions;</w:t>
+      </w:r>
     </w:p>
     <w:p>
       <w:pPr>
@@ -101,13 +94,16 @@
         </w:numPr>
       </w:pPr>
       <w:r>
-        <w:t xml:space="preserve">Track the progress of work </w:t>
-      </w:r>
-      <w:proofErr w:type="gramStart"/>
-      <w:r>
-        <w:t>items</w:t>
-      </w:r>
-      <w:proofErr w:type="gramEnd"/>
+        <w:t xml:space="preserve">representing individual units of work as </w:t>
+      </w:r>
+      <w:proofErr w:type="spellStart"/>
+      <w:r>
+        <w:t>WorkItems</w:t>
+      </w:r>
+      <w:proofErr w:type="spellEnd"/>
+      <w:r>
+        <w:t>;</w:t>
+      </w:r>
     </w:p>
     <w:p>
       <w:pPr>
@@ -118,13 +114,8 @@
         </w:numPr>
       </w:pPr>
       <w:r>
-        <w:t xml:space="preserve">Control the routing of work from one activity to </w:t>
-      </w:r>
-      <w:proofErr w:type="gramStart"/>
-      <w:r>
-        <w:t>another</w:t>
-      </w:r>
-      <w:proofErr w:type="gramEnd"/>
+        <w:t>organising work into Stages and nested sub-processes;</w:t>
+      </w:r>
     </w:p>
     <w:p>
       <w:pPr>
@@ -135,13 +126,16 @@
         </w:numPr>
       </w:pPr>
       <w:r>
-        <w:t xml:space="preserve">Assign work to the correct </w:t>
-      </w:r>
-      <w:proofErr w:type="gramStart"/>
-      <w:r>
-        <w:t>participants</w:t>
-      </w:r>
-      <w:proofErr w:type="gramEnd"/>
+        <w:t xml:space="preserve">managing dependencies between </w:t>
+      </w:r>
+      <w:proofErr w:type="spellStart"/>
+      <w:r>
+        <w:t>WorkItems</w:t>
+      </w:r>
+      <w:proofErr w:type="spellEnd"/>
+      <w:r>
+        <w:t>;</w:t>
+      </w:r>
     </w:p>
     <w:p>
       <w:pPr>
@@ -152,16 +146,209 @@
         </w:numPr>
       </w:pPr>
       <w:r>
+        <w:t>supporting both sequential and parallel work;</w:t>
+      </w:r>
+    </w:p>
+    <w:p>
+      <w:pPr>
+        <w:pStyle w:val="ListParagraph"/>
+        <w:numPr>
+          <w:ilvl w:val="0"/>
+          <w:numId w:val="8"/>
+        </w:numPr>
+      </w:pPr>
+      <w:r>
+        <w:t xml:space="preserve">assigning available </w:t>
+      </w:r>
+      <w:proofErr w:type="spellStart"/>
+      <w:r>
+        <w:t>WorkItems</w:t>
+      </w:r>
+      <w:proofErr w:type="spellEnd"/>
+      <w:r>
+        <w:t xml:space="preserve"> to suitable participants according to configurable rules;</w:t>
+      </w:r>
+    </w:p>
+    <w:p>
+      <w:pPr>
+        <w:pStyle w:val="ListParagraph"/>
+        <w:numPr>
+          <w:ilvl w:val="0"/>
+          <w:numId w:val="8"/>
+        </w:numPr>
+      </w:pPr>
+      <w:r>
+        <w:t xml:space="preserve">managing the lifecycle of </w:t>
+      </w:r>
+      <w:proofErr w:type="spellStart"/>
+      <w:r>
+        <w:t>WorkItems</w:t>
+      </w:r>
+      <w:proofErr w:type="spellEnd"/>
+      <w:r>
+        <w:t>;</w:t>
+      </w:r>
+    </w:p>
+    <w:p>
+      <w:pPr>
+        <w:pStyle w:val="ListParagraph"/>
+        <w:numPr>
+          <w:ilvl w:val="0"/>
+          <w:numId w:val="8"/>
+        </w:numPr>
+      </w:pPr>
+      <w:r>
+        <w:t>applying routing rules to determine which work becomes available next;</w:t>
+      </w:r>
+    </w:p>
+    <w:p>
+      <w:pPr>
+        <w:pStyle w:val="ListParagraph"/>
+        <w:numPr>
+          <w:ilvl w:val="0"/>
+          <w:numId w:val="8"/>
+        </w:numPr>
+      </w:pPr>
+      <w:r>
+        <w:t>supporting approvals, rejection and escalation;</w:t>
+      </w:r>
+    </w:p>
+    <w:p>
+      <w:pPr>
+        <w:pStyle w:val="ListParagraph"/>
+        <w:numPr>
+          <w:ilvl w:val="0"/>
+          <w:numId w:val="8"/>
+        </w:numPr>
+      </w:pPr>
+      <w:r>
+        <w:t>reacting to internal and external events;</w:t>
+      </w:r>
+    </w:p>
+    <w:p>
+      <w:pPr>
+        <w:pStyle w:val="ListParagraph"/>
+        <w:numPr>
+          <w:ilvl w:val="0"/>
+          <w:numId w:val="8"/>
+        </w:numPr>
+      </w:pPr>
+      <w:r>
+        <w:t>communicating with external systems through generic integration interfaces;</w:t>
+      </w:r>
+    </w:p>
+    <w:p>
+      <w:pPr>
+        <w:pStyle w:val="ListParagraph"/>
+        <w:numPr>
+          <w:ilvl w:val="0"/>
+          <w:numId w:val="8"/>
+        </w:numPr>
+      </w:pPr>
+      <w:r>
+        <w:t>maintaining workflow history and state changes;</w:t>
+      </w:r>
+    </w:p>
+    <w:p>
+      <w:pPr>
+        <w:pStyle w:val="ListParagraph"/>
+        <w:numPr>
+          <w:ilvl w:val="0"/>
+          <w:numId w:val="8"/>
+        </w:numPr>
+      </w:pPr>
+      <w:r>
+        <w:t>supporting recovery or rollback where appropriate; and</w:t>
+      </w:r>
+    </w:p>
+    <w:p>
+      <w:pPr>
+        <w:pStyle w:val="ListParagraph"/>
+        <w:numPr>
+          <w:ilvl w:val="0"/>
+          <w:numId w:val="8"/>
+        </w:numPr>
+      </w:pPr>
+      <w:r>
+        <w:t xml:space="preserve">exposing workflow information for monitoring and </w:t>
+      </w:r>
+      <w:proofErr w:type="spellStart"/>
+      <w:r>
+        <w:t>reporting.</w:t>
+      </w:r>
+      <w:r>
+        <w:t>reate</w:t>
+      </w:r>
+      <w:proofErr w:type="spellEnd"/>
+      <w:r>
+        <w:t xml:space="preserve"> and manage running workflow instances</w:t>
+      </w:r>
+    </w:p>
+    <w:p>
+      <w:pPr>
+        <w:pStyle w:val="ListParagraph"/>
+        <w:numPr>
+          <w:ilvl w:val="0"/>
+          <w:numId w:val="8"/>
+        </w:numPr>
+      </w:pPr>
+      <w:r>
+        <w:t>Manage the work items and tasks in a workflow</w:t>
+      </w:r>
+    </w:p>
+    <w:p>
+      <w:pPr>
+        <w:pStyle w:val="ListParagraph"/>
+        <w:numPr>
+          <w:ilvl w:val="0"/>
+          <w:numId w:val="8"/>
+        </w:numPr>
+      </w:pPr>
+      <w:r>
+        <w:t>Track the progress of work items</w:t>
+      </w:r>
+    </w:p>
+    <w:p>
+      <w:pPr>
+        <w:pStyle w:val="ListParagraph"/>
+        <w:numPr>
+          <w:ilvl w:val="0"/>
+          <w:numId w:val="8"/>
+        </w:numPr>
+      </w:pPr>
+      <w:r>
+        <w:t>Control the routing of work from one activity to another</w:t>
+      </w:r>
+    </w:p>
+    <w:p>
+      <w:pPr>
+        <w:pStyle w:val="ListParagraph"/>
+        <w:numPr>
+          <w:ilvl w:val="0"/>
+          <w:numId w:val="8"/>
+        </w:numPr>
+      </w:pPr>
+      <w:r>
+        <w:t>Assign work to the correct participants</w:t>
+      </w:r>
+    </w:p>
+    <w:p>
+      <w:pPr>
+        <w:pStyle w:val="ListParagraph"/>
+        <w:numPr>
+          <w:ilvl w:val="0"/>
+          <w:numId w:val="8"/>
+        </w:numPr>
+      </w:pPr>
+      <w:r>
         <w:t>Manages</w:t>
       </w:r>
       <w:r>
         <w:t xml:space="preserve"> approvals, rejections, failures in the </w:t>
       </w:r>
-      <w:proofErr w:type="gramStart"/>
       <w:r>
         <w:t>system</w:t>
       </w:r>
-      <w:proofErr w:type="gramEnd"/>
     </w:p>
     <w:p>
       <w:pPr>
@@ -172,13 +359,8 @@
         </w:numPr>
       </w:pPr>
       <w:r>
-        <w:t xml:space="preserve">Communicate with external systems when </w:t>
-      </w:r>
-      <w:proofErr w:type="gramStart"/>
-      <w:r>
-        <w:t>required</w:t>
-      </w:r>
-      <w:proofErr w:type="gramEnd"/>
+        <w:t>Communicate with external systems when required</w:t>
+      </w:r>
     </w:p>
     <w:p>
       <w:pPr>
@@ -189,13 +371,8 @@
         </w:numPr>
       </w:pPr>
       <w:r>
-        <w:t xml:space="preserve">Notify interested participants when changes </w:t>
-      </w:r>
-      <w:proofErr w:type="gramStart"/>
-      <w:r>
-        <w:t>occur</w:t>
-      </w:r>
-      <w:proofErr w:type="gramEnd"/>
+        <w:t>Notify interested participants when changes occur</w:t>
+      </w:r>
     </w:p>
     <w:p>
       <w:pPr>
@@ -206,19 +383,15 @@
         </w:numPr>
       </w:pPr>
       <w:r>
-        <w:t xml:space="preserve">Maintain a history of important workflow </w:t>
-      </w:r>
-      <w:proofErr w:type="gramStart"/>
-      <w:r>
-        <w:t>actions</w:t>
-      </w:r>
-      <w:proofErr w:type="gramEnd"/>
+        <w:t>Maintain a history of important workflow actions</w:t>
+      </w:r>
     </w:p>
     <w:p>
       <w:pPr>
         <w:pStyle w:val="Heading2"/>
       </w:pPr>
       <w:r>
+        <w:lastRenderedPageBreak/>
         <w:t>Boundaries</w:t>
       </w:r>
     </w:p>
@@ -400,101 +573,205 @@
         </w:numPr>
       </w:pPr>
       <w:r>
+        <w:t>The order in which work occurs</w:t>
+      </w:r>
+    </w:p>
+    <w:p>
+      <w:pPr>
+        <w:pStyle w:val="ListParagraph"/>
+        <w:numPr>
+          <w:ilvl w:val="0"/>
+          <w:numId w:val="10"/>
+        </w:numPr>
+      </w:pPr>
+      <w:r>
+        <w:t xml:space="preserve">Valid </w:t>
+      </w:r>
+      <w:r>
+        <w:t>transitions</w:t>
+      </w:r>
+      <w:r>
+        <w:t xml:space="preserve"> between stages</w:t>
+      </w:r>
+    </w:p>
+    <w:p>
+      <w:pPr>
+        <w:pStyle w:val="ListParagraph"/>
+        <w:numPr>
+          <w:ilvl w:val="0"/>
+          <w:numId w:val="10"/>
+        </w:numPr>
+      </w:pPr>
+      <w:r>
+        <w:t>Routing rules</w:t>
+      </w:r>
+    </w:p>
+    <w:p>
+      <w:pPr>
+        <w:pStyle w:val="ListParagraph"/>
+        <w:numPr>
+          <w:ilvl w:val="0"/>
+          <w:numId w:val="10"/>
+        </w:numPr>
+      </w:pPr>
+      <w:r>
+        <w:t>Assignment rules</w:t>
+      </w:r>
+    </w:p>
+    <w:p>
+      <w:pPr>
+        <w:pStyle w:val="ListParagraph"/>
+        <w:numPr>
+          <w:ilvl w:val="0"/>
+          <w:numId w:val="10"/>
+        </w:numPr>
+      </w:pPr>
+      <w:r>
+        <w:t>Approval and escalation requirements</w:t>
+      </w:r>
+    </w:p>
+    <w:p>
+      <w:pPr>
+        <w:pStyle w:val="ListParagraph"/>
+        <w:numPr>
+          <w:ilvl w:val="0"/>
+          <w:numId w:val="10"/>
+        </w:numPr>
+      </w:pPr>
+      <w:r>
+        <w:t>Possible events and failure paths</w:t>
+      </w:r>
+    </w:p>
+    <w:p>
+      <w:r>
+        <w:t xml:space="preserve">The definition does not represent one </w:t>
+      </w:r>
+      <w:r>
+        <w:t>active</w:t>
+      </w:r>
+      <w:r>
+        <w:t xml:space="preserve"> </w:t>
+      </w:r>
+      <w:r>
+        <w:t>execution</w:t>
+      </w:r>
+      <w:r>
+        <w:t xml:space="preserve"> of a process. It acts as a template from which multiple workflow instances may be created.</w:t>
+      </w:r>
+    </w:p>
+    <w:p>
+      <w:pPr>
+        <w:pStyle w:val="Heading2"/>
+      </w:pPr>
+      <w:r>
+        <w:t>Running Workflow Instance</w:t>
+      </w:r>
+    </w:p>
+    <w:p>
+      <w:pPr>
+        <w:pStyle w:val="ListParagraph"/>
+        <w:numPr>
+          <w:ilvl w:val="0"/>
+          <w:numId w:val="12"/>
+        </w:numPr>
+      </w:pPr>
+      <w:r>
+        <w:t>Represents one active execution of a workflow definition.</w:t>
+      </w:r>
+    </w:p>
+    <w:p>
+      <w:r>
+        <w:t>Each instance should contain its own runtime information:</w:t>
+      </w:r>
+    </w:p>
+    <w:p>
+      <w:pPr>
+        <w:pStyle w:val="ListParagraph"/>
+        <w:numPr>
+          <w:ilvl w:val="0"/>
+          <w:numId w:val="11"/>
+        </w:numPr>
+      </w:pPr>
+      <w:r>
+        <w:t xml:space="preserve">A unique instance identifier </w:t>
+      </w:r>
+    </w:p>
+    <w:p>
+      <w:pPr>
+        <w:pStyle w:val="ListParagraph"/>
+        <w:numPr>
+          <w:ilvl w:val="0"/>
+          <w:numId w:val="11"/>
+        </w:numPr>
+      </w:pPr>
+      <w:r>
+        <w:t>The current workflow state</w:t>
+      </w:r>
+    </w:p>
+    <w:p>
+      <w:pPr>
+        <w:pStyle w:val="ListParagraph"/>
+        <w:numPr>
+          <w:ilvl w:val="0"/>
+          <w:numId w:val="11"/>
+        </w:numPr>
+      </w:pPr>
+      <w:r>
+        <w:t>The participants assigned to work</w:t>
+      </w:r>
+    </w:p>
+    <w:p>
+      <w:pPr>
+        <w:pStyle w:val="ListParagraph"/>
+        <w:numPr>
+          <w:ilvl w:val="0"/>
+          <w:numId w:val="11"/>
+        </w:numPr>
+      </w:pPr>
+      <w:r>
+        <w:t>Current progress</w:t>
+      </w:r>
+    </w:p>
+    <w:p>
+      <w:pPr>
+        <w:pStyle w:val="ListParagraph"/>
+        <w:numPr>
+          <w:ilvl w:val="0"/>
+          <w:numId w:val="11"/>
+        </w:numPr>
+      </w:pPr>
+      <w:r>
+        <w:t>Timestamps</w:t>
+      </w:r>
+    </w:p>
+    <w:p>
+      <w:pPr>
+        <w:pStyle w:val="ListParagraph"/>
+        <w:numPr>
+          <w:ilvl w:val="0"/>
+          <w:numId w:val="11"/>
+        </w:numPr>
+      </w:pPr>
+      <w:r>
+        <w:t>Failures or exceptions that have occurred</w:t>
+      </w:r>
+    </w:p>
+    <w:p>
+      <w:pPr>
+        <w:pStyle w:val="ListParagraph"/>
+        <w:numPr>
+          <w:ilvl w:val="0"/>
+          <w:numId w:val="11"/>
+        </w:numPr>
+      </w:pPr>
+      <w:r>
+        <w:t>Execution history</w:t>
+      </w:r>
+    </w:p>
+    <w:p>
+      <w:r>
         <w:lastRenderedPageBreak/>
-        <w:t xml:space="preserve">The order in which work </w:t>
-      </w:r>
-      <w:proofErr w:type="gramStart"/>
-      <w:r>
-        <w:t>occurs</w:t>
-      </w:r>
-      <w:proofErr w:type="gramEnd"/>
-    </w:p>
-    <w:p>
-      <w:pPr>
-        <w:pStyle w:val="ListParagraph"/>
-        <w:numPr>
-          <w:ilvl w:val="0"/>
-          <w:numId w:val="10"/>
-        </w:numPr>
-      </w:pPr>
-      <w:r>
-        <w:t xml:space="preserve">Valid </w:t>
-      </w:r>
-      <w:r>
-        <w:t>transitions</w:t>
-      </w:r>
-      <w:r>
-        <w:t xml:space="preserve"> between stages</w:t>
-      </w:r>
-    </w:p>
-    <w:p>
-      <w:pPr>
-        <w:pStyle w:val="ListParagraph"/>
-        <w:numPr>
-          <w:ilvl w:val="0"/>
-          <w:numId w:val="10"/>
-        </w:numPr>
-      </w:pPr>
-      <w:r>
-        <w:t>Routing rules</w:t>
-      </w:r>
-    </w:p>
-    <w:p>
-      <w:pPr>
-        <w:pStyle w:val="ListParagraph"/>
-        <w:numPr>
-          <w:ilvl w:val="0"/>
-          <w:numId w:val="10"/>
-        </w:numPr>
-      </w:pPr>
-      <w:r>
-        <w:t>Assignment rules</w:t>
-      </w:r>
-    </w:p>
-    <w:p>
-      <w:pPr>
-        <w:pStyle w:val="ListParagraph"/>
-        <w:numPr>
-          <w:ilvl w:val="0"/>
-          <w:numId w:val="10"/>
-        </w:numPr>
-      </w:pPr>
-      <w:r>
-        <w:t>Approval and escalation requirements</w:t>
-      </w:r>
-    </w:p>
-    <w:p>
-      <w:pPr>
-        <w:pStyle w:val="ListParagraph"/>
-        <w:numPr>
-          <w:ilvl w:val="0"/>
-          <w:numId w:val="10"/>
-        </w:numPr>
-      </w:pPr>
-      <w:proofErr w:type="gramStart"/>
-      <w:r>
-        <w:t>Possible events</w:t>
-      </w:r>
-      <w:proofErr w:type="gramEnd"/>
-      <w:r>
-        <w:t xml:space="preserve"> and failure paths</w:t>
-      </w:r>
-    </w:p>
-    <w:p>
-      <w:r>
-        <w:t xml:space="preserve">The definition does not represent one </w:t>
-      </w:r>
-      <w:r>
-        <w:t>active</w:t>
-      </w:r>
-      <w:r>
-        <w:t xml:space="preserve"> </w:t>
-      </w:r>
-      <w:r>
-        <w:t>execution</w:t>
-      </w:r>
-      <w:r>
-        <w:t xml:space="preserve"> of a process. It acts as a template from which multiple workflow instances may be created.</w:t>
+        <w:t>Multiple workflow instance will use the same workflow definition while being at completely different points in the process.</w:t>
       </w:r>
     </w:p>
     <w:p>
@@ -502,280 +779,155 @@
         <w:pStyle w:val="Heading2"/>
       </w:pPr>
       <w:r>
-        <w:t>Running Workflow Instance</w:t>
-      </w:r>
-    </w:p>
-    <w:p>
-      <w:pPr>
-        <w:pStyle w:val="ListParagraph"/>
-        <w:numPr>
-          <w:ilvl w:val="0"/>
-          <w:numId w:val="12"/>
-        </w:numPr>
-      </w:pPr>
-      <w:r>
-        <w:t>Represents one active execution of a workflow definition.</w:t>
-      </w:r>
-    </w:p>
-    <w:p>
-      <w:r>
-        <w:t>Each instance should contain its own runtime information:</w:t>
-      </w:r>
-    </w:p>
-    <w:p>
-      <w:pPr>
-        <w:pStyle w:val="ListParagraph"/>
-        <w:numPr>
-          <w:ilvl w:val="0"/>
-          <w:numId w:val="11"/>
-        </w:numPr>
-      </w:pPr>
-      <w:r>
-        <w:t xml:space="preserve">A unique instance identifier </w:t>
-      </w:r>
-    </w:p>
-    <w:p>
-      <w:pPr>
-        <w:pStyle w:val="ListParagraph"/>
-        <w:numPr>
-          <w:ilvl w:val="0"/>
-          <w:numId w:val="11"/>
-        </w:numPr>
-      </w:pPr>
-      <w:r>
-        <w:t>The current workflow state</w:t>
-      </w:r>
-    </w:p>
-    <w:p>
-      <w:pPr>
-        <w:pStyle w:val="ListParagraph"/>
-        <w:numPr>
-          <w:ilvl w:val="0"/>
-          <w:numId w:val="11"/>
-        </w:numPr>
-      </w:pPr>
-      <w:r>
-        <w:t>The participants assigned to work</w:t>
-      </w:r>
-    </w:p>
-    <w:p>
-      <w:pPr>
-        <w:pStyle w:val="ListParagraph"/>
-        <w:numPr>
-          <w:ilvl w:val="0"/>
-          <w:numId w:val="11"/>
-        </w:numPr>
-      </w:pPr>
-      <w:r>
-        <w:t>Current progress</w:t>
-      </w:r>
-    </w:p>
-    <w:p>
-      <w:pPr>
-        <w:pStyle w:val="ListParagraph"/>
-        <w:numPr>
-          <w:ilvl w:val="0"/>
-          <w:numId w:val="11"/>
-        </w:numPr>
-      </w:pPr>
-      <w:r>
-        <w:t>Timestamps</w:t>
-      </w:r>
-    </w:p>
-    <w:p>
-      <w:pPr>
-        <w:pStyle w:val="ListParagraph"/>
-        <w:numPr>
-          <w:ilvl w:val="0"/>
-          <w:numId w:val="11"/>
-        </w:numPr>
-      </w:pPr>
-      <w:r>
-        <w:t xml:space="preserve">Failures or exceptions that have </w:t>
-      </w:r>
-      <w:proofErr w:type="gramStart"/>
-      <w:r>
-        <w:t>occurred</w:t>
-      </w:r>
-      <w:proofErr w:type="gramEnd"/>
-    </w:p>
-    <w:p>
-      <w:pPr>
-        <w:pStyle w:val="ListParagraph"/>
-        <w:numPr>
-          <w:ilvl w:val="0"/>
-          <w:numId w:val="11"/>
-        </w:numPr>
-      </w:pPr>
-      <w:r>
-        <w:t>Execution history</w:t>
-      </w:r>
-    </w:p>
-    <w:p>
-      <w:r>
-        <w:t>Multiple workflow instance will use the same workflow definition while being at completely different points in the process.</w:t>
-      </w:r>
-    </w:p>
+        <w:t>Parts of the system expected to vary</w:t>
+      </w:r>
+    </w:p>
+    <w:p>
+      <w:pPr>
+        <w:pStyle w:val="ListParagraph"/>
+        <w:numPr>
+          <w:ilvl w:val="0"/>
+          <w:numId w:val="13"/>
+        </w:numPr>
+      </w:pPr>
+      <w:r>
+        <w:t xml:space="preserve">This depends on the organisation  or process being </w:t>
+      </w:r>
+      <w:r>
+        <w:t>executed.</w:t>
+      </w:r>
+    </w:p>
+    <w:p>
+      <w:r>
+        <w:t>Includes:</w:t>
+      </w:r>
+    </w:p>
+    <w:p>
+      <w:pPr>
+        <w:pStyle w:val="ListParagraph"/>
+        <w:numPr>
+          <w:ilvl w:val="0"/>
+          <w:numId w:val="13"/>
+        </w:numPr>
+      </w:pPr>
+      <w:r>
+        <w:t>routing rules</w:t>
+      </w:r>
+    </w:p>
+    <w:p>
+      <w:pPr>
+        <w:pStyle w:val="ListParagraph"/>
+        <w:numPr>
+          <w:ilvl w:val="0"/>
+          <w:numId w:val="13"/>
+        </w:numPr>
+      </w:pPr>
+      <w:r>
+        <w:t>participant and task assignment rules</w:t>
+      </w:r>
+    </w:p>
+    <w:p>
+      <w:pPr>
+        <w:pStyle w:val="ListParagraph"/>
+        <w:numPr>
+          <w:ilvl w:val="0"/>
+          <w:numId w:val="13"/>
+        </w:numPr>
+      </w:pPr>
+      <w:r>
+        <w:t>validation rules</w:t>
+      </w:r>
+    </w:p>
+    <w:p>
+      <w:pPr>
+        <w:pStyle w:val="ListParagraph"/>
+        <w:numPr>
+          <w:ilvl w:val="0"/>
+          <w:numId w:val="13"/>
+        </w:numPr>
+      </w:pPr>
+      <w:r>
+        <w:t>approval requirements</w:t>
+      </w:r>
+    </w:p>
+    <w:p>
+      <w:pPr>
+        <w:pStyle w:val="ListParagraph"/>
+        <w:numPr>
+          <w:ilvl w:val="0"/>
+          <w:numId w:val="13"/>
+        </w:numPr>
+      </w:pPr>
+      <w:r>
+        <w:t>escalation rules</w:t>
+      </w:r>
+    </w:p>
+    <w:p>
+      <w:pPr>
+        <w:pStyle w:val="ListParagraph"/>
+        <w:numPr>
+          <w:ilvl w:val="0"/>
+          <w:numId w:val="13"/>
+        </w:numPr>
+      </w:pPr>
+      <w:r>
+        <w:t>actions performed during the workflow</w:t>
+      </w:r>
+    </w:p>
+    <w:p>
+      <w:pPr>
+        <w:pStyle w:val="ListParagraph"/>
+        <w:numPr>
+          <w:ilvl w:val="0"/>
+          <w:numId w:val="13"/>
+        </w:numPr>
+      </w:pPr>
+      <w:r>
+        <w:t>external systems used</w:t>
+      </w:r>
+    </w:p>
+    <w:p>
+      <w:pPr>
+        <w:pStyle w:val="ListParagraph"/>
+        <w:numPr>
+          <w:ilvl w:val="0"/>
+          <w:numId w:val="13"/>
+        </w:numPr>
+      </w:pPr>
+      <w:r>
+        <w:t>notification recipients</w:t>
+      </w:r>
+    </w:p>
+    <w:p>
+      <w:pPr>
+        <w:pStyle w:val="ListParagraph"/>
+        <w:numPr>
+          <w:ilvl w:val="0"/>
+          <w:numId w:val="13"/>
+        </w:numPr>
+      </w:pPr>
+      <w:r>
+        <w:t>execution strategies</w:t>
+      </w:r>
+    </w:p>
+    <w:p>
+      <w:pPr>
+        <w:pStyle w:val="ListParagraph"/>
+        <w:numPr>
+          <w:ilvl w:val="0"/>
+          <w:numId w:val="13"/>
+        </w:numPr>
+      </w:pPr>
+      <w:r>
+        <w:t>optional behaviour added to work items</w:t>
+      </w:r>
+    </w:p>
+    <w:p/>
     <w:p>
       <w:pPr>
         <w:pStyle w:val="Heading2"/>
       </w:pPr>
       <w:r>
-        <w:t xml:space="preserve">Parts of the system expected to </w:t>
-      </w:r>
-      <w:proofErr w:type="gramStart"/>
-      <w:r>
-        <w:t>vary</w:t>
-      </w:r>
-      <w:proofErr w:type="gramEnd"/>
-    </w:p>
-    <w:p>
-      <w:pPr>
-        <w:pStyle w:val="ListParagraph"/>
-        <w:numPr>
-          <w:ilvl w:val="0"/>
-          <w:numId w:val="13"/>
-        </w:numPr>
-      </w:pPr>
-      <w:r>
-        <w:t xml:space="preserve">This depends on the organisation  or process being </w:t>
-      </w:r>
-      <w:r>
-        <w:t>executed.</w:t>
-      </w:r>
-    </w:p>
-    <w:p>
-      <w:r>
-        <w:t>Includes:</w:t>
-      </w:r>
-    </w:p>
-    <w:p>
-      <w:pPr>
-        <w:pStyle w:val="ListParagraph"/>
-        <w:numPr>
-          <w:ilvl w:val="0"/>
-          <w:numId w:val="13"/>
-        </w:numPr>
-      </w:pPr>
-      <w:r>
-        <w:t>routing rules</w:t>
-      </w:r>
-    </w:p>
-    <w:p>
-      <w:pPr>
-        <w:pStyle w:val="ListParagraph"/>
-        <w:numPr>
-          <w:ilvl w:val="0"/>
-          <w:numId w:val="13"/>
-        </w:numPr>
-      </w:pPr>
-      <w:r>
-        <w:t>participant and task assignment rules</w:t>
-      </w:r>
-    </w:p>
-    <w:p>
-      <w:pPr>
-        <w:pStyle w:val="ListParagraph"/>
-        <w:numPr>
-          <w:ilvl w:val="0"/>
-          <w:numId w:val="13"/>
-        </w:numPr>
-      </w:pPr>
-      <w:r>
-        <w:t>validation rules</w:t>
-      </w:r>
-    </w:p>
-    <w:p>
-      <w:pPr>
-        <w:pStyle w:val="ListParagraph"/>
-        <w:numPr>
-          <w:ilvl w:val="0"/>
-          <w:numId w:val="13"/>
-        </w:numPr>
-      </w:pPr>
-      <w:r>
-        <w:t>approval requirements</w:t>
-      </w:r>
-    </w:p>
-    <w:p>
-      <w:pPr>
-        <w:pStyle w:val="ListParagraph"/>
-        <w:numPr>
-          <w:ilvl w:val="0"/>
-          <w:numId w:val="13"/>
-        </w:numPr>
-      </w:pPr>
-      <w:r>
-        <w:t>escalation rules</w:t>
-      </w:r>
-    </w:p>
-    <w:p>
-      <w:pPr>
-        <w:pStyle w:val="ListParagraph"/>
-        <w:numPr>
-          <w:ilvl w:val="0"/>
-          <w:numId w:val="13"/>
-        </w:numPr>
-      </w:pPr>
-      <w:r>
-        <w:t>actions performed during the workflow</w:t>
-      </w:r>
-    </w:p>
-    <w:p>
-      <w:pPr>
-        <w:pStyle w:val="ListParagraph"/>
-        <w:numPr>
-          <w:ilvl w:val="0"/>
-          <w:numId w:val="13"/>
-        </w:numPr>
-      </w:pPr>
-      <w:r>
-        <w:t>external systems used</w:t>
-      </w:r>
-    </w:p>
-    <w:p>
-      <w:pPr>
-        <w:pStyle w:val="ListParagraph"/>
-        <w:numPr>
-          <w:ilvl w:val="0"/>
-          <w:numId w:val="13"/>
-        </w:numPr>
-      </w:pPr>
-      <w:r>
-        <w:t>notification recipients</w:t>
-      </w:r>
-    </w:p>
-    <w:p>
-      <w:pPr>
-        <w:pStyle w:val="ListParagraph"/>
-        <w:numPr>
-          <w:ilvl w:val="0"/>
-          <w:numId w:val="13"/>
-        </w:numPr>
-      </w:pPr>
-      <w:r>
-        <w:t>execution strategies</w:t>
-      </w:r>
-    </w:p>
-    <w:p>
-      <w:pPr>
-        <w:pStyle w:val="ListParagraph"/>
-        <w:numPr>
-          <w:ilvl w:val="0"/>
-          <w:numId w:val="13"/>
-        </w:numPr>
-      </w:pPr>
-      <w:r>
-        <w:t>optional behaviour added to work items</w:t>
-      </w:r>
-    </w:p>
-    <w:p/>
-    <w:p>
-      <w:pPr>
-        <w:pStyle w:val="Heading2"/>
-      </w:pPr>
-      <w:r>
-        <w:lastRenderedPageBreak/>
         <w:t>Selected Workflow: ArkhamExpress</w:t>
       </w:r>
     </w:p>
@@ -951,6 +1103,7 @@
         </w:numPr>
       </w:pPr>
       <w:r>
+        <w:lastRenderedPageBreak/>
         <w:t>Failed</w:t>
       </w:r>
     </w:p>
@@ -989,13 +1142,8 @@
         <w:t>an</w:t>
       </w:r>
       <w:r>
-        <w:t xml:space="preserve"> </w:t>
-      </w:r>
-      <w:proofErr w:type="gramStart"/>
-      <w:r>
-        <w:t>order</w:t>
-      </w:r>
-      <w:proofErr w:type="gramEnd"/>
+        <w:t xml:space="preserve"> order</w:t>
+      </w:r>
     </w:p>
     <w:p>
       <w:pPr>
@@ -1012,13 +1160,8 @@
         <w:t>notifications</w:t>
       </w:r>
       <w:r>
-        <w:t xml:space="preserve"> regarding </w:t>
-      </w:r>
-      <w:proofErr w:type="gramStart"/>
-      <w:r>
-        <w:t>order</w:t>
-      </w:r>
-      <w:proofErr w:type="gramEnd"/>
+        <w:t xml:space="preserve"> regarding order</w:t>
+      </w:r>
     </w:p>
     <w:p>
       <w:pPr>
@@ -1031,11 +1174,9 @@
       <w:r>
         <w:t xml:space="preserve">Receives final </w:t>
       </w:r>
-      <w:proofErr w:type="gramStart"/>
       <w:r>
         <w:t>package</w:t>
       </w:r>
-      <w:proofErr w:type="gramEnd"/>
     </w:p>
     <w:p>
       <w:pPr>
@@ -1067,13 +1208,8 @@
         </w:numPr>
       </w:pPr>
       <w:r>
-        <w:t xml:space="preserve">Locate required </w:t>
-      </w:r>
-      <w:proofErr w:type="gramStart"/>
-      <w:r>
-        <w:t>stock</w:t>
-      </w:r>
-      <w:proofErr w:type="gramEnd"/>
+        <w:t>Locate required stock</w:t>
+      </w:r>
     </w:p>
     <w:p>
       <w:pPr>
@@ -1086,11 +1222,9 @@
       <w:r>
         <w:t xml:space="preserve">Prepare </w:t>
       </w:r>
-      <w:proofErr w:type="gramStart"/>
       <w:r>
         <w:t>products</w:t>
       </w:r>
-      <w:proofErr w:type="gramEnd"/>
     </w:p>
     <w:p>
       <w:pPr>
@@ -1101,13 +1235,8 @@
         </w:numPr>
       </w:pPr>
       <w:r>
-        <w:t xml:space="preserve">Prepare package for </w:t>
-      </w:r>
-      <w:proofErr w:type="gramStart"/>
-      <w:r>
-        <w:t>dispatch</w:t>
-      </w:r>
-      <w:proofErr w:type="gramEnd"/>
+        <w:t>Prepare package for dispatch</w:t>
+      </w:r>
     </w:p>
     <w:p>
       <w:pPr>
@@ -1136,15 +1265,7 @@
         </w:numPr>
       </w:pPr>
       <w:r>
-        <w:t xml:space="preserve">Receives the delivery </w:t>
-      </w:r>
-      <w:proofErr w:type="gramStart"/>
-      <w:r>
-        <w:t>assignment</w:t>
-      </w:r>
-      <w:proofErr w:type="gramEnd"/>
-      <w:r>
-        <w:t xml:space="preserve"> </w:t>
+        <w:t xml:space="preserve">Receives the delivery assignment </w:t>
       </w:r>
     </w:p>
     <w:p>
@@ -1156,13 +1277,8 @@
         </w:numPr>
       </w:pPr>
       <w:r>
-        <w:t xml:space="preserve">Collects the </w:t>
-      </w:r>
-      <w:proofErr w:type="gramStart"/>
-      <w:r>
-        <w:t>package</w:t>
-      </w:r>
-      <w:proofErr w:type="gramEnd"/>
+        <w:t>Collects the package</w:t>
+      </w:r>
     </w:p>
     <w:p>
       <w:pPr>
@@ -1173,13 +1289,8 @@
         </w:numPr>
       </w:pPr>
       <w:r>
-        <w:t xml:space="preserve">Completes the </w:t>
-      </w:r>
-      <w:proofErr w:type="gramStart"/>
-      <w:r>
-        <w:t>deliver</w:t>
-      </w:r>
-      <w:proofErr w:type="gramEnd"/>
+        <w:t>Completes the deliver</w:t>
+      </w:r>
     </w:p>
     <w:p>
       <w:pPr>
@@ -1203,7 +1314,6 @@
         </w:numPr>
       </w:pPr>
       <w:r>
-        <w:lastRenderedPageBreak/>
         <w:t>Delivery Manager</w:t>
       </w:r>
     </w:p>
@@ -1215,19 +1325,9 @@
           <w:numId w:val="20"/>
         </w:numPr>
       </w:pPr>
-      <w:proofErr w:type="gramStart"/>
-      <w:r>
-        <w:t>handles</w:t>
-      </w:r>
-      <w:proofErr w:type="gramEnd"/>
-      <w:r>
-        <w:t xml:space="preserve"> exceptional </w:t>
-      </w:r>
-      <w:proofErr w:type="gramStart"/>
-      <w:r>
-        <w:t>situations</w:t>
-      </w:r>
-      <w:proofErr w:type="gramEnd"/>
+      <w:r>
+        <w:t>handles exceptional situations</w:t>
+      </w:r>
     </w:p>
     <w:p>
       <w:pPr>
@@ -1238,13 +1338,8 @@
         </w:numPr>
       </w:pPr>
       <w:r>
-        <w:t xml:space="preserve">approves certain special actions where </w:t>
-      </w:r>
-      <w:proofErr w:type="gramStart"/>
-      <w:r>
-        <w:t>required</w:t>
-      </w:r>
-      <w:proofErr w:type="gramEnd"/>
+        <w:t>approves certain special actions where required</w:t>
+      </w:r>
     </w:p>
     <w:p>
       <w:pPr>
@@ -1255,13 +1350,8 @@
         </w:numPr>
       </w:pPr>
       <w:r>
-        <w:t xml:space="preserve">assists with failed or escalated </w:t>
-      </w:r>
-      <w:proofErr w:type="gramStart"/>
-      <w:r>
-        <w:t>deliveries</w:t>
-      </w:r>
-      <w:proofErr w:type="gramEnd"/>
+        <w:t>assists with failed or escalated deliveries</w:t>
+      </w:r>
     </w:p>
     <w:p>
       <w:pPr>
@@ -1290,13 +1380,8 @@
         </w:numPr>
       </w:pPr>
       <w:r>
-        <w:t xml:space="preserve">manages the </w:t>
-      </w:r>
-      <w:proofErr w:type="gramStart"/>
-      <w:r>
-        <w:t>workflow</w:t>
-      </w:r>
-      <w:proofErr w:type="gramEnd"/>
+        <w:t>manages the workflow</w:t>
+      </w:r>
     </w:p>
     <w:p>
       <w:pPr>
@@ -1307,13 +1392,8 @@
         </w:numPr>
       </w:pPr>
       <w:r>
-        <w:t xml:space="preserve">routes </w:t>
-      </w:r>
-      <w:proofErr w:type="gramStart"/>
-      <w:r>
-        <w:t>work</w:t>
-      </w:r>
-      <w:proofErr w:type="gramEnd"/>
+        <w:t>routes work</w:t>
+      </w:r>
     </w:p>
     <w:p>
       <w:pPr>
@@ -1324,13 +1404,8 @@
         </w:numPr>
       </w:pPr>
       <w:r>
-        <w:t xml:space="preserve">tracks the current </w:t>
-      </w:r>
-      <w:proofErr w:type="gramStart"/>
-      <w:r>
-        <w:t>state</w:t>
-      </w:r>
-      <w:proofErr w:type="gramEnd"/>
+        <w:t>tracks the current state</w:t>
+      </w:r>
     </w:p>
     <w:p>
       <w:pPr>
@@ -1341,13 +1416,8 @@
         </w:numPr>
       </w:pPr>
       <w:r>
-        <w:t xml:space="preserve">assigns </w:t>
-      </w:r>
-      <w:proofErr w:type="gramStart"/>
-      <w:r>
-        <w:t>work</w:t>
-      </w:r>
-      <w:proofErr w:type="gramEnd"/>
+        <w:t>assigns work</w:t>
+      </w:r>
     </w:p>
     <w:p>
       <w:pPr>
@@ -1358,13 +1428,8 @@
         </w:numPr>
       </w:pPr>
       <w:r>
-        <w:t xml:space="preserve">reacts to workflow </w:t>
-      </w:r>
-      <w:proofErr w:type="gramStart"/>
-      <w:r>
-        <w:t>events</w:t>
-      </w:r>
-      <w:proofErr w:type="gramEnd"/>
+        <w:t>reacts to workflow events</w:t>
+      </w:r>
     </w:p>
     <w:p/>
     <w:p>
@@ -1384,13 +1449,8 @@
         </w:numPr>
       </w:pPr>
       <w:r>
-        <w:t xml:space="preserve">Receives the customer </w:t>
-      </w:r>
-      <w:proofErr w:type="gramStart"/>
-      <w:r>
-        <w:t>order</w:t>
-      </w:r>
-      <w:proofErr w:type="gramEnd"/>
+        <w:t>Receives the customer order</w:t>
+      </w:r>
     </w:p>
     <w:p>
       <w:pPr>
@@ -1401,13 +1461,8 @@
         </w:numPr>
       </w:pPr>
       <w:r>
-        <w:t xml:space="preserve">Validate the </w:t>
-      </w:r>
-      <w:proofErr w:type="gramStart"/>
-      <w:r>
-        <w:t>order</w:t>
-      </w:r>
-      <w:proofErr w:type="gramEnd"/>
+        <w:t>Validate the order</w:t>
+      </w:r>
     </w:p>
     <w:p>
       <w:pPr>
@@ -1418,15 +1473,7 @@
         </w:numPr>
       </w:pPr>
       <w:r>
-        <w:t xml:space="preserve">Check product </w:t>
-      </w:r>
-      <w:proofErr w:type="gramStart"/>
-      <w:r>
-        <w:t>availability</w:t>
-      </w:r>
-      <w:proofErr w:type="gramEnd"/>
-      <w:r>
-        <w:t xml:space="preserve"> </w:t>
+        <w:t xml:space="preserve">Check product availability </w:t>
       </w:r>
     </w:p>
     <w:p>
@@ -1438,15 +1485,7 @@
         </w:numPr>
       </w:pPr>
       <w:r>
-        <w:t xml:space="preserve">Request missing stock if </w:t>
-      </w:r>
-      <w:proofErr w:type="gramStart"/>
-      <w:r>
-        <w:t>necessary</w:t>
-      </w:r>
-      <w:proofErr w:type="gramEnd"/>
-      <w:r>
-        <w:t xml:space="preserve"> </w:t>
+        <w:t xml:space="preserve">Request missing stock if necessary </w:t>
       </w:r>
     </w:p>
     <w:p>
@@ -1458,15 +1497,7 @@
         </w:numPr>
       </w:pPr>
       <w:r>
-        <w:t xml:space="preserve">Prepare the </w:t>
-      </w:r>
-      <w:proofErr w:type="gramStart"/>
-      <w:r>
-        <w:t>package</w:t>
-      </w:r>
-      <w:proofErr w:type="gramEnd"/>
-      <w:r>
-        <w:t xml:space="preserve"> </w:t>
+        <w:t xml:space="preserve">Prepare the package </w:t>
       </w:r>
     </w:p>
     <w:p>
@@ -1478,13 +1509,8 @@
         </w:numPr>
       </w:pPr>
       <w:r>
-        <w:t xml:space="preserve">Select the required delivery </w:t>
-      </w:r>
-      <w:proofErr w:type="gramStart"/>
-      <w:r>
-        <w:t>type</w:t>
-      </w:r>
-      <w:proofErr w:type="gramEnd"/>
+        <w:t>Select the required delivery type</w:t>
+      </w:r>
     </w:p>
     <w:p>
       <w:pPr>
@@ -1495,13 +1521,9 @@
         </w:numPr>
       </w:pPr>
       <w:r>
-        <w:t xml:space="preserve">Determine the delivery </w:t>
-      </w:r>
-      <w:proofErr w:type="gramStart"/>
-      <w:r>
-        <w:t>method</w:t>
-      </w:r>
-      <w:proofErr w:type="gramEnd"/>
+        <w:lastRenderedPageBreak/>
+        <w:t>Determine the delivery method</w:t>
+      </w:r>
     </w:p>
     <w:p>
       <w:pPr>
@@ -1512,13 +1534,8 @@
         </w:numPr>
       </w:pPr>
       <w:r>
-        <w:t xml:space="preserve">Assign a </w:t>
-      </w:r>
-      <w:proofErr w:type="gramStart"/>
-      <w:r>
-        <w:t>driver</w:t>
-      </w:r>
-      <w:proofErr w:type="gramEnd"/>
+        <w:t>Assign a driver</w:t>
+      </w:r>
     </w:p>
     <w:p>
       <w:pPr>
@@ -1529,13 +1546,8 @@
         </w:numPr>
       </w:pPr>
       <w:r>
-        <w:t xml:space="preserve">Dispatch the </w:t>
-      </w:r>
-      <w:proofErr w:type="gramStart"/>
-      <w:r>
-        <w:t>package</w:t>
-      </w:r>
-      <w:proofErr w:type="gramEnd"/>
+        <w:t>Dispatch the package</w:t>
+      </w:r>
     </w:p>
     <w:p>
       <w:pPr>
@@ -1546,15 +1558,7 @@
         </w:numPr>
       </w:pPr>
       <w:r>
-        <w:t xml:space="preserve">Track the </w:t>
-      </w:r>
-      <w:proofErr w:type="gramStart"/>
-      <w:r>
-        <w:t>delivery</w:t>
-      </w:r>
-      <w:proofErr w:type="gramEnd"/>
-      <w:r>
-        <w:t xml:space="preserve"> </w:t>
+        <w:t xml:space="preserve">Track the delivery </w:t>
       </w:r>
     </w:p>
     <w:p>
@@ -1566,15 +1570,7 @@
         </w:numPr>
       </w:pPr>
       <w:r>
-        <w:t xml:space="preserve">Complete the </w:t>
-      </w:r>
-      <w:proofErr w:type="gramStart"/>
-      <w:r>
-        <w:t>delivery</w:t>
-      </w:r>
-      <w:proofErr w:type="gramEnd"/>
-      <w:r>
-        <w:t xml:space="preserve"> </w:t>
+        <w:t xml:space="preserve">Complete the delivery </w:t>
       </w:r>
     </w:p>
     <w:p>
@@ -1643,18 +1639,11 @@
         <w:t>or cancelling a delivery</w:t>
       </w:r>
     </w:p>
-    <w:p/>
-    <w:p/>
-    <w:p/>
-    <w:p/>
-    <w:p/>
-    <w:p/>
     <w:p>
       <w:pPr>
         <w:pStyle w:val="Heading2"/>
       </w:pPr>
       <w:r>
-        <w:lastRenderedPageBreak/>
         <w:t>Important decisions and Rerouting points</w:t>
       </w:r>
     </w:p>
@@ -1687,13 +1676,8 @@
         </w:numPr>
       </w:pPr>
       <w:r>
-        <w:t xml:space="preserve">Yes – the package can be </w:t>
-      </w:r>
-      <w:proofErr w:type="gramStart"/>
-      <w:r>
-        <w:t>prepared</w:t>
-      </w:r>
-      <w:proofErr w:type="gramEnd"/>
+        <w:t>Yes – the package can be prepared</w:t>
+      </w:r>
     </w:p>
     <w:p>
       <w:pPr>
@@ -1710,13 +1694,8 @@
         <w:t>o</w:t>
       </w:r>
       <w:r>
-        <w:t xml:space="preserve"> – the stock must be </w:t>
-      </w:r>
-      <w:proofErr w:type="gramStart"/>
-      <w:r>
-        <w:t>requested</w:t>
-      </w:r>
-      <w:proofErr w:type="gramEnd"/>
+        <w:t xml:space="preserve"> – the stock must be requested</w:t>
+      </w:r>
     </w:p>
     <w:p>
       <w:pPr>
@@ -1840,13 +1819,8 @@
         </w:numPr>
       </w:pPr>
       <w:r>
-        <w:t xml:space="preserve">Yes – the driver is </w:t>
-      </w:r>
-      <w:proofErr w:type="gramStart"/>
-      <w:r>
-        <w:t>assigned</w:t>
-      </w:r>
-      <w:proofErr w:type="gramEnd"/>
+        <w:t>Yes – the driver is assigned</w:t>
+      </w:r>
     </w:p>
     <w:p>
       <w:pPr>
@@ -1869,13 +1843,8 @@
         <w:t>work,</w:t>
       </w:r>
       <w:r>
-        <w:t xml:space="preserve"> or escalate the </w:t>
-      </w:r>
-      <w:proofErr w:type="gramStart"/>
-      <w:r>
-        <w:t>problem</w:t>
-      </w:r>
-      <w:proofErr w:type="gramEnd"/>
+        <w:t xml:space="preserve"> or escalate the problem</w:t>
+      </w:r>
     </w:p>
     <w:p>
       <w:pPr>
@@ -1906,13 +1875,8 @@
         </w:numPr>
       </w:pPr>
       <w:r>
-        <w:t xml:space="preserve">Yes – the workflow is </w:t>
-      </w:r>
-      <w:proofErr w:type="gramStart"/>
-      <w:r>
-        <w:t>completed</w:t>
-      </w:r>
-      <w:proofErr w:type="gramEnd"/>
+        <w:t>Yes – the workflow is completed</w:t>
+      </w:r>
     </w:p>
     <w:p>
       <w:pPr>
@@ -1940,21 +1904,8 @@
         <w:t>retry</w:t>
       </w:r>
       <w:r>
-        <w:t xml:space="preserve">, reroute, </w:t>
-      </w:r>
-      <w:proofErr w:type="gramStart"/>
-      <w:r>
-        <w:t>return</w:t>
-      </w:r>
-      <w:proofErr w:type="gramEnd"/>
-      <w:r>
-        <w:t xml:space="preserve"> or cancel </w:t>
-      </w:r>
-      <w:proofErr w:type="gramStart"/>
-      <w:r>
-        <w:t>delivery</w:t>
-      </w:r>
-      <w:proofErr w:type="gramEnd"/>
+        <w:t>, reroute, return or cancel delivery</w:t>
+      </w:r>
     </w:p>
     <w:p>
       <w:pPr>
@@ -1976,13 +1927,8 @@
         </w:numPr>
       </w:pPr>
       <w:r>
-        <w:t xml:space="preserve">an order must be validated before it can </w:t>
-      </w:r>
-      <w:proofErr w:type="gramStart"/>
-      <w:r>
-        <w:t>continue</w:t>
-      </w:r>
-      <w:proofErr w:type="gramEnd"/>
+        <w:t>an order must be validated before it can continue</w:t>
+      </w:r>
     </w:p>
     <w:p>
       <w:pPr>
@@ -1993,13 +1939,8 @@
         </w:numPr>
       </w:pPr>
       <w:r>
-        <w:t xml:space="preserve">stock must be available before the package can be </w:t>
-      </w:r>
-      <w:proofErr w:type="gramStart"/>
-      <w:r>
-        <w:t>prepared</w:t>
-      </w:r>
-      <w:proofErr w:type="gramEnd"/>
+        <w:t>stock must be available before the package can be prepared</w:t>
+      </w:r>
     </w:p>
     <w:p>
       <w:pPr>
@@ -2010,13 +1951,8 @@
         </w:numPr>
       </w:pPr>
       <w:r>
-        <w:t xml:space="preserve">the package must be prepared before it can be </w:t>
-      </w:r>
-      <w:proofErr w:type="gramStart"/>
-      <w:r>
-        <w:t>dispatched</w:t>
-      </w:r>
-      <w:proofErr w:type="gramEnd"/>
+        <w:t>the package must be prepared before it can be dispatched</w:t>
+      </w:r>
     </w:p>
     <w:p>
       <w:pPr>
@@ -2027,13 +1963,8 @@
         </w:numPr>
       </w:pPr>
       <w:r>
-        <w:t xml:space="preserve">a driver must be assigned before delivery can </w:t>
-      </w:r>
-      <w:proofErr w:type="gramStart"/>
-      <w:r>
-        <w:t>begin</w:t>
-      </w:r>
-      <w:proofErr w:type="gramEnd"/>
+        <w:t>a driver must be assigned before delivery can begin</w:t>
+      </w:r>
     </w:p>
     <w:p>
       <w:pPr>
@@ -2044,13 +1975,8 @@
         </w:numPr>
       </w:pPr>
       <w:r>
-        <w:t xml:space="preserve">the package must be dispatched before the delivery can be </w:t>
-      </w:r>
-      <w:proofErr w:type="gramStart"/>
-      <w:r>
-        <w:t>completed</w:t>
-      </w:r>
-      <w:proofErr w:type="gramEnd"/>
+        <w:t>the package must be dispatched before the delivery can be completed</w:t>
+      </w:r>
     </w:p>
     <w:p>
       <w:r>
@@ -2065,15 +1991,8 @@
     </w:p>
     <w:p>
       <w:r>
-        <w:t xml:space="preserve">Approval may also be required in certain exceptional cases. For example, a high-value or special delivery may require approval from a Delivery Manager before dispatch. Approval may also be required before certain cancellations, rerouting </w:t>
-      </w:r>
-      <w:proofErr w:type="gramStart"/>
-      <w:r>
-        <w:t>decisions</w:t>
-      </w:r>
-      <w:proofErr w:type="gramEnd"/>
-      <w:r>
-        <w:t xml:space="preserve"> or special handling actions.</w:t>
+        <w:lastRenderedPageBreak/>
+        <w:t>Approval may also be required in certain exceptional cases. For example, a high-value or special delivery may require approval from a Delivery Manager before dispatch. Approval may also be required before certain cancellations, rerouting decisions or special handling actions.</w:t>
       </w:r>
     </w:p>
     <w:p>
@@ -2092,13 +2011,8 @@
           <w:numId w:val="31"/>
         </w:numPr>
       </w:pPr>
-      <w:proofErr w:type="gramStart"/>
-      <w:r>
-        <w:t>Possible failures</w:t>
-      </w:r>
-      <w:proofErr w:type="gramEnd"/>
-      <w:r>
-        <w:t xml:space="preserve"> and exceptional situations include:</w:t>
+      <w:r>
+        <w:t>Possible failures and exceptional situations include:</w:t>
       </w:r>
     </w:p>
     <w:p>
@@ -2110,13 +2024,8 @@
         </w:numPr>
       </w:pPr>
       <w:r>
-        <w:t xml:space="preserve">the order failing </w:t>
-      </w:r>
-      <w:proofErr w:type="gramStart"/>
-      <w:r>
-        <w:t>validation</w:t>
-      </w:r>
-      <w:proofErr w:type="gramEnd"/>
+        <w:t>the order failing validation</w:t>
+      </w:r>
     </w:p>
     <w:p>
       <w:pPr>
@@ -2127,13 +2036,8 @@
         </w:numPr>
       </w:pPr>
       <w:r>
-        <w:t xml:space="preserve">required stock being </w:t>
-      </w:r>
-      <w:proofErr w:type="gramStart"/>
-      <w:r>
-        <w:t>unavailable</w:t>
-      </w:r>
-      <w:proofErr w:type="gramEnd"/>
+        <w:t>required stock being unavailable</w:t>
+      </w:r>
     </w:p>
     <w:p>
       <w:pPr>
@@ -2144,13 +2048,8 @@
         </w:numPr>
       </w:pPr>
       <w:r>
-        <w:t xml:space="preserve">an external stock request </w:t>
-      </w:r>
-      <w:proofErr w:type="gramStart"/>
-      <w:r>
-        <w:t>failing</w:t>
-      </w:r>
-      <w:proofErr w:type="gramEnd"/>
+        <w:t>an external stock request failing</w:t>
+      </w:r>
     </w:p>
     <w:p>
       <w:pPr>
@@ -2161,13 +2060,8 @@
         </w:numPr>
       </w:pPr>
       <w:r>
-        <w:t xml:space="preserve">no driver being </w:t>
-      </w:r>
-      <w:proofErr w:type="gramStart"/>
-      <w:r>
-        <w:t>available</w:t>
-      </w:r>
-      <w:proofErr w:type="gramEnd"/>
+        <w:t>no driver being available</w:t>
+      </w:r>
     </w:p>
     <w:p>
       <w:pPr>
@@ -2178,13 +2072,8 @@
         </w:numPr>
       </w:pPr>
       <w:r>
-        <w:t xml:space="preserve">a package being </w:t>
-      </w:r>
-      <w:proofErr w:type="gramStart"/>
-      <w:r>
-        <w:t>damaged</w:t>
-      </w:r>
-      <w:proofErr w:type="gramEnd"/>
+        <w:t>a package being damaged</w:t>
+      </w:r>
     </w:p>
     <w:p>
       <w:pPr>
@@ -2207,14 +2096,8 @@
         </w:numPr>
       </w:pPr>
       <w:r>
-        <w:lastRenderedPageBreak/>
-        <w:t xml:space="preserve">the customer being </w:t>
-      </w:r>
-      <w:proofErr w:type="gramStart"/>
-      <w:r>
-        <w:t>unavailable</w:t>
-      </w:r>
-      <w:proofErr w:type="gramEnd"/>
+        <w:t>the customer being unavailable</w:t>
+      </w:r>
     </w:p>
     <w:p>
       <w:pPr>
@@ -2225,13 +2108,8 @@
         </w:numPr>
       </w:pPr>
       <w:r>
-        <w:t xml:space="preserve">a delivery attempt </w:t>
-      </w:r>
-      <w:proofErr w:type="gramStart"/>
-      <w:r>
-        <w:t>failing</w:t>
-      </w:r>
-      <w:proofErr w:type="gramEnd"/>
+        <w:t>a delivery attempt failing</w:t>
+      </w:r>
     </w:p>
     <w:p>
       <w:pPr>
@@ -2242,13 +2120,8 @@
         </w:numPr>
       </w:pPr>
       <w:r>
-        <w:t xml:space="preserve">an external warehouse or courier system being </w:t>
-      </w:r>
-      <w:proofErr w:type="gramStart"/>
-      <w:r>
-        <w:t>unavailable</w:t>
-      </w:r>
-      <w:proofErr w:type="gramEnd"/>
+        <w:t>an external warehouse or courier system being unavailable</w:t>
+      </w:r>
     </w:p>
     <w:p>
       <w:pPr>
@@ -6892,6 +6765,7 @@
   <w:style w:type="character" w:default="1" w:styleId="DefaultParagraphFont">
     <w:name w:val="Default Paragraph Font"/>
     <w:uiPriority w:val="1"/>
+    <w:semiHidden/>
     <w:unhideWhenUsed/>
   </w:style>
   <w:style w:type="table" w:default="1" w:styleId="TableNormal">

</xml_diff>